<commit_message>
Incorpora cinco libros al artículo sobre Altiplano
- Scott: la legibilidad en el despojo de Kero-Pata, en el tinterillo y
  en las huellas dactilares de la mina; en la novela la manejan poderes
  locales y una compañía, no un Estado central.
- Dean: los mojones como memoria de la posesión (saywa) y una crítica
  de género más precisa sobre la Pachamama.
- Frampton: estereotomía y tectónica en la chujlla; la cosecha de
  piedras como estereotomía sin edificio.
- Garrington: la mano leída y la galería medida con el cuerpo.
- Le Guin: la novela como bolsa frente a la flecha de la mina.
- Refuerza la lectura del infolio como manuaje burocrático.
- Añade analisis/07_cinco_libros.md (pasajes con página, función,
  límite y propuestas no adoptadas) y actualiza fichero, guía,
  pendientes, convocatoria, marco y README.

Co-Authored-By: Claude Opus 5.5 <noreply@anthropic.com>
Claude-Session: https://claude.ai/code/session_01QWC9b4jcZbzQ8czhYUvPYd
</commit_message>
<xml_diff>
--- a/articulo/articulo_altiplano.docx
+++ b/articulo/articulo_altiplano.docx
@@ -380,6 +380,14 @@
       </w:pPr>
       <w:r>
         <w:t xml:space="preserve">La segunda, Richard Martin, aporta preguntas comparativas. Su estudio del cine de David Lynch parte de que la cultura contiene «una comprensión espacial y arquitectónica sin explotar», cuyo sitio «está en sus ficciones» (Shonfield, 2000: 173, cit. en Martin, 2014: 7), y lee la casa entre dos polos: la de Bachelard, que «protege al soñador» (Bachelard, 1994 [1958]: 6, cit. en Martin, 2014: 63), y la de Lynch, «un lugar donde las cosas pueden salir mal» (Rodley, 2005: 10, cit. en Martin, 2014: 64). Tomamos de él la pregunta por cómo participan interiores, umbrales y recorridos en una ficción, sin suponer influencia de Lynch sobre Botelho ni identidad entre sus mundos.</w:t>
+      </w:r>
+    </w:p>
+    <w:p>
+      <w:pPr>
+        <w:pStyle w:val="BodyText"/>
+      </w:pPr>
+      <w:r>
+        <w:t xml:space="preserve">Otras cinco lecturas intervienen solo donde una escena las necesita, y allí se presentan con sus límites: James C. Scott, para los papeles con que la autoridad vuelve registrables la tierra y las personas; Carolyn Dean, para las piedras que, en la tradición andina, marcaban y recordaban la posesión; Kenneth Frampton, para los dos modos de construir que la novela describe; Abbie Garrington, para el registro corporal del espacio, y Ursula K. Le Guin, para la forma de la novela y su memoria.</w:t>
       </w:r>
     </w:p>
     <w:p>
@@ -775,23 +783,60 @@
         <w:pStyle w:val="FirstParagraph"/>
       </w:pPr>
       <w:r>
-        <w:t xml:space="preserve">La tierra del ayllu está desigualmente repartida. Los Villca tienen «bajo su mano lo menos una quinta parte de las tierras de labranza» (Botelho Gosálvez, 1982 [1945]: 20); su antepasado Pedro «empotró en el suelo del ayllu las estacas de propiedad y empezó a dominar» (ibid.). Los demás tienen «cuatro o cinco hectáreas de tierras de labor por familia» (ibid.: 21); los peones sin tierra que trabajan para los Villca «reciben como salario el puchero y la casa» (ibid.), y cuando la comunidad ha «colmado la medida de resistencia», los expulsa (ibid.: 22). Los Villca sostienen su preeminencia con genealogías inventadas porque «necesitaban aquel blasón para sustentar su orgullo y su riqueza» (ibid.: 28), y a los antepasados de Juan Condori los habían amparado las «Cédulas Reales» antes de que los despojaran «los papeles del Gobierno» (ibid.: 36-37): ni el relato oral ni el documento escrito tienen una orientación política fija. El narrador ordena esa desigualdad con el vocabulario de la ciudad: los Villca «son la burguesía usurpadora»; los Huanca, Huallpa, Yupanqui, Ticona, Choque y Chuquihuanca, «los pequeño-burgueses»; los Condori, Mamani y Quispe, «sin heredad ni salario», «el proletariado campesino» (ibid.: 22). Es su valoración, no la del ayllu.</w:t>
-      </w:r>
-    </w:p>
-    <w:p>
-      <w:pPr>
-        <w:pStyle w:val="BodyText"/>
-      </w:pPr>
-      <w:r>
-        <w:t xml:space="preserve">La vivienda de los Huanca muestra cómo se sostiene la vida en esas condiciones. Son «tres chujllas de adobe y paja brava» en torno a un patio; «no tienen cuartos», «apenas se alzan dos metros del suelo», sus paredes están «renegridas por el hollín» del brasero central, los camastros se elevan «apenas la altura de un adobe» y de las vigas «cuelgan las hoces, el arado, el yugo de madera» (ibid.: 30-31). Doce personas viven de «cuatro mezquinas hectáreas y siete ovejas roñosas» y siembran «hasta aquellos sitios donde sólo brotan el abrojo, entre piedras y arena» (ibid.: 30). Una peste de las ovejas ha dejado los telares «apoyados en la más oscura esquina de la chujlla» como «extraños armatostes de madera abandonados» (ibid.: 29). No hay armonía originaria, sino deterioro: «La vida deviene decadencia para los Huanca» (ibid.: 31). La casa abriga y guarda las herramientas, pero no alcanza para todos.</w:t>
-      </w:r>
-    </w:p>
-    <w:p>
-      <w:pPr>
-        <w:pStyle w:val="BodyText"/>
-      </w:pPr>
-      <w:r>
-        <w:t xml:space="preserve">Esa insuficiencia se decide dentro de la casa, en la primera escena elegida para la exploración gráfica. Una noche de invierno, Paulo Huanca llama a sus tres hijos mayores. «Una mecha de sebo ardía en una larga repisa de madera sobre la cual dormían las gallinas»; los niños miran desde el jergón; el padre está «en cuclillas, cerca del fuego»; detrás, la madre escarmena lana, y las mujeres permanecen «apoyadas contra la pared» (ibid.: 31-32). El padre no tiene qué dejarles —«la escasez de tierras me tiene preocupado. ¿Qué voy a darles como patrimonio? No tengo nada»— y les pide que se vayan (ibid.: 32); si tienen suerte, podrán volver y «pedir a los Villca que les vendan unas cuantas hectáreas» (ibid.: 33). Dos días después los mira partir «desde el portal de su chujlla» y vuelve a entrar para salir «con la madera del arado en un hombro y las correas del yugo en las manos» (ibid.: 34). La permanencia de unos exige la salida de otros, y la decisión se toma junto al fuego. La casa que, para Bachelard, protege al soñador encuentra aquí su límite en la cantidad de tierra disponible.</w:t>
+        <w:t xml:space="preserve">La tierra del ayllu está desigualmente repartida. Los Villca tienen «bajo su mano lo menos una quinta parte de las tierras de labranza» (Botelho Gosálvez, 1982 [1945]: 20). Los demás tienen «cuatro o cinco hectáreas de tierras de labor por familia» (ibid.: 21); los peones sin tierra que trabajan para los Villca «reciben como salario el puchero y la casa» (ibid.), y cuando la comunidad ha «colmado la medida de resistencia», los expulsa (ibid.: 22). El narrador ordena esa desigualdad con el vocabulario de la ciudad: los Villca «son la burguesía usurpadora»; los Huanca, Huallpa, Yupanqui, Ticona, Choque y Chuquihuanca, «los pequeño-burgueses»; los Condori, Mamani y Quispe, «sin heredad ni salario», «el proletariado campesino» (ibid.). Es su valoración, no la del ayllu.</w:t>
+      </w:r>
+    </w:p>
+    <w:p>
+      <w:pPr>
+        <w:pStyle w:val="BodyText"/>
+      </w:pPr>
+      <w:r>
+        <w:t xml:space="preserve">La posesión, por su parte, se marca con piedra, madera y papel. Los «mojones» que desde antiguo «señalan las pertenencias originarias del ayllu» (ibid.: 9) recuerdan la</w:t>
+      </w:r>
+      <w:r>
+        <w:t xml:space="preserve"> </w:t>
+      </w:r>
+      <w:r>
+        <w:rPr>
+          <w:i/>
+          <w:iCs/>
+        </w:rPr>
+        <w:t xml:space="preserve">saywa</w:t>
+      </w:r>
+      <w:r>
+        <w:t xml:space="preserve"> </w:t>
+      </w:r>
+      <w:r>
+        <w:t xml:space="preserve">inca que estudia Carolyn Dean: una piedra de lindero que «conmemoraba el acto de marcar el territorio» y, como testigo, sostenía la memoria de los derechos sobre la tierra (Dean, 2010: 46). El antepasado de los Villca, Pedro, «empotró en el suelo del ayllu las estacas de propiedad y empezó a dominar» (Botelho Gosálvez, 1982 [1945]: 20). Y en Kero-Pata, donde las «Cédulas Reales» habían amparado a los antepasados de Juan Condori, la tierra pasa a un doctor tras «una gran cuestión de títulos, papel sellado y pago de impuestos», porque «así lo declaraban los papeles del Gobierno» (ibid.: 36-37). Scott describe ese mecanismo al estudiar la legibilidad estatal: un catastro fiscal «no se limita a describir un sistema de tenencia de la tierra; lo crea», porque da a sus categorías «la fuerza de la ley» (Scott, 2020 [1998]: 3). Ninguno de esos soportes tiene una orientación política fija, como tampoco el relato oral: los Villca sostienen su preeminencia con genealogías inventadas porque «necesitaban aquel blasón para sustentar su orgullo y su riqueza» (Botelho Gosálvez, 1982 [1945]: 28). La novela no usa la palabra</w:t>
+      </w:r>
+      <w:r>
+        <w:t xml:space="preserve"> </w:t>
+      </w:r>
+      <w:r>
+        <w:rPr>
+          <w:i/>
+          <w:iCs/>
+        </w:rPr>
+        <w:t xml:space="preserve">saywa</w:t>
+      </w:r>
+      <w:r>
+        <w:t xml:space="preserve">; la comparación sirve para no leer sus mojones como simples límites.</w:t>
+      </w:r>
+    </w:p>
+    <w:p>
+      <w:pPr>
+        <w:pStyle w:val="BodyText"/>
+      </w:pPr>
+      <w:r>
+        <w:t xml:space="preserve">La vivienda de los Huanca muestra cómo se sostiene la vida en esas condiciones. Son «tres chujllas de adobe y paja brava» en torno a un patio; «no tienen cuartos», «apenas se alzan dos metros del suelo», sus paredes están «renegridas por el hollín» del brasero central, los camastros se elevan «apenas la altura de un adobe» y de las vigas «cuelgan las hoces, el arado, el yugo de madera» (ibid.: 30-31). Doce personas viven de «cuatro mezquinas hectáreas y siete ovejas roñosas» y siembran «hasta aquellos sitios donde sólo brotan el abrojo, entre piedras y arena» (ibid.: 30). Una peste de las ovejas ha dejado los telares «apoyados en la más oscura esquina de la chujlla» como «extraños armatostes de madera abandonados» (ibid.: 29). No hay armonía originaria, sino deterioro: «La vida deviene decadencia para los Huanca» (ibid.: 31). Su descripción separa, además, los dos modos de construir que Kenneth Frampton, siguiendo a Gottfried Semper, llama estereotómico y tectónico: la masa que se forma por «apilamiento repetitivo de elementos pesados», «ya sea piedra o adobe», y el armazón de «componentes ligeros y lineales», afín a la cestería y al textil (Frampton, 1995: 5). Los muros son de adobe y de las piedras del cerro (Botelho Gosálvez, 1982 [1945]: 8, 30); las vigas van «mal unidas con lazos de paja trenzada» (ibid.: 31), y el lado del tejido, el de los telares, es el primero que se pierde. Vista así, la cosecha de piedras del comienzo es estereotomía sin edificio: la operación con que se levantan cimientos y pircas no produce allí un techo, sino un montón. La taxonomía, que Semper formuló a partir de una choza caribeña exhibida en Londres en 1851 (Frampton, 1995: 5), es un instrumento del investigador, no una categoría del mundo narrado. La casa abriga y guarda las herramientas, pero no alcanza para todos.</w:t>
+      </w:r>
+    </w:p>
+    <w:p>
+      <w:pPr>
+        <w:pStyle w:val="BodyText"/>
+      </w:pPr>
+      <w:r>
+        <w:t xml:space="preserve">Esa insuficiencia se decide dentro de la casa, en la primera escena elegida para la exploración gráfica. Una noche de invierno, Paulo Huanca llama a sus tres hijos mayores. «Una mecha de sebo ardía en una larga repisa de madera sobre la cual dormían las gallinas»; los niños miran desde el jergón; el padre está «en cuclillas, cerca del fuego»; detrás, la madre escarmena lana, y las mujeres permanecen «apoyadas contra la pared» (Botelho Gosálvez, 1982 [1945]: 31-32). El padre no tiene qué dejarles —«la escasez de tierras me tiene preocupado. ¿Qué voy a darles como patrimonio? No tengo nada»— y les pide que se vayan (ibid.: 32); si tienen suerte, podrán volver y «pedir a los Villca que les vendan unas cuantas hectáreas» (ibid.: 33). Dos días después los mira partir «desde el portal de su chujlla» y vuelve a entrar para salir «con la madera del arado en un hombro y las correas del yugo en las manos» (ibid.: 34). La permanencia de unos exige la salida de otros, y la decisión se toma junto al fuego. La casa que, para Bachelard, protege al soñador encuentra aquí su límite en la cantidad de tierra disponible.</w:t>
       </w:r>
     </w:p>
     <w:p>
@@ -850,7 +895,7 @@
         <w:pStyle w:val="BodyText"/>
       </w:pPr>
       <w:r>
-        <w:t xml:space="preserve">La segunda escena elegida transcurre en otro cuarto. Vicente busca a un tinterillo, cuyo nombre la novela no da, para reclamar una indemnización mayor. La oficina es «un cuartucho maloliente, de piso de ladrillos; una mugrienta mesa con un tintero y un desordenado montón de papeles y libracos encima; tres sillas y un sofá destripado» (ibid.: 103). El letrado señala «un Código Penal en infolio y un manual del Procedimiento Civil» y convierte el tamaño en eficacia: el grande «tiene más peso legal y jurídico que el chiquitito», y con él sus honorarios son de «seiscientos bolivianos, la mitad adelantados» (ibid.: 104). Una propiedad física del objeto se vuelve argumento de autoridad y, enseguida, precio. Vicente calcula y desconfía —«estos tinterillos son de una sola casta y todos obran con una mala fe del demonio»— y rechaza la defensa (ibid.). El tinterillo le exige entonces cincuenta bolivianos por la consulta, con una amenaza: «te encierro por conspirar contra la autoridad municipal» (ibid.: 105). Vicente desanuda la faja donde guarda «un atado de pobres y traposos billetes» y paga; ante el dinero, el letrado le ofrece la defensa por cuatrocientos, y Vicente vuelve a negarse y sale a la calle, «libre ya de la amenaza del letrado» (ibid.). Salir del cuarto fue posible, pero tuvo precio. La escena no enfrenta a un indio sin juicio con la escritura: articula la materialidad del libro, un argumento fraudulento, el juicio del personaje y la coerción que convierte su negativa en deuda.</w:t>
+        <w:t xml:space="preserve">La segunda escena elegida transcurre en otro cuarto. Vicente busca a un tinterillo, cuyo nombre la novela no da, para reclamar una indemnización mayor. La oficina es «un cuartucho maloliente, de piso de ladrillos; una mugrienta mesa con un tintero y un desordenado montón de papeles y libracos encima; tres sillas y un sofá destripado» (ibid.: 103). El letrado señala «un Código Penal en infolio y un manual del Procedimiento Civil» y convierte el tamaño en eficacia: el grande «tiene más peso legal y jurídico que el chiquitito», y con él sus honorarios son de «seiscientos bolivianos, la mitad adelantados» (ibid.: 104). Una propiedad física del libro, su peso, se vuelve argumento de autoridad y, enseguida, precio. Es un manuaje burocrático: el letrado no escribe nada; señala, compara y, después, cuenta billetes sobre la mesa. El escritorio que Cárcamo Pino sitúa en el mismo repertorio que la caja de herramientas (2025a: 12) funciona aquí como instrumento de cobro, y lo que se cobra es una lectura: la del derecho de propiedad moderno, mediado por el Estado, que según Scott solo resulta «fácilmente descifrable» para quienes tienen «la formación suficiente» y dominan las leyes del Estado (Scott, 2020 [1998]: 35-36). Vicente no puede leer ese código, pero lee a quien lo vende —«estos tinterillos son de una sola casta y todos obran con una mala fe del demonio»— y rechaza la defensa (Botelho Gosálvez, 1982 [1945]: 104). El tinterillo le exige entonces cincuenta bolivianos por la consulta, con una amenaza: «te encierro por conspirar contra la autoridad municipal» (ibid.: 105). Vicente desanuda la faja donde guarda «un atado de pobres y traposos billetes» y paga; ante el dinero, el letrado le ofrece la defensa por cuatrocientos, y Vicente vuelve a negarse y sale a la calle, «libre ya de la amenaza del letrado» (ibid.). Salir del cuarto fue posible, pero tuvo precio. La escena no enfrenta a un indio sin juicio con la escritura: articula la materialidad del libro, un argumento fraudulento, el juicio del personaje y la coerción que convierte su negativa en deuda.</w:t>
       </w:r>
     </w:p>
     <w:p>
@@ -910,7 +955,15 @@
         <w:pStyle w:val="FirstParagraph"/>
       </w:pPr>
       <w:r>
-        <w:t xml:space="preserve">Juan Condori llega sin recursos a la mina «Pensylvania», de la compañía The Star Syndicate, y una chola le fía el primer desayuno (ibid.: 134-137). La empresa lo registra antes de admitirlo: un médico lo examina y «firmó una papeleta en que le daba de alta», y en la oficina «tomaron su identidad e impresiones digitales» (ibid.: 139-140). La mano del peón entra en el archivo de la compañía antes que en la galería. Esa tarde repara «las infinitas hendijas y goteras» de su casucha (ibid.: 140), como al llegar a Jatun-Kolla había repuesto «la techumbre de paja» de una chujlla abandonada (ibid.: 35): alojarse exige trabajo propio. El capataz le anuncia una cosecha nueva —«Aquí cosecharás miles de cargas de estaño»— y le muestra su esputo sanguinolento: «esta es la bonificación» (ibid.: 142). El ascensorista Calixto baja luego la jaula donde siete hombres van «apeñuscados contra la rejilla» (ibid.: 143). Martin lee el ascensor de</w:t>
+        <w:t xml:space="preserve">Juan Condori llega sin recursos a la mina «Pensylvania», de la compañía The Star Syndicate, y una chola le fía el primer desayuno (ibid.: 134-137). La empresa lo registra antes de admitirlo: un médico lo examina y «firmó una papeleta en que le daba de alta», y en la oficina «tomaron su identidad e impresiones digitales» (ibid.: 139-140). La mano del peón entra en el archivo de la compañía antes que en la galería. Garrington recuerda que la mano que lee el mundo «también puede ser leída», y leída para establecer la identidad de su dueño (Garrington, 2013: 2): la compañía vuelve legible al peón, en el sentido de Scott, antes de bajarlo. Esa tarde repara «las infinitas hendijas y goteras» de su casucha (Botelho Gosálvez, 1982 [1945]: 140), como al llegar a Jatun-Kolla había repuesto «la techumbre de paja» de una chujlla abandonada (ibid.: 35): alojarse exige trabajo propio.</w:t>
+      </w:r>
+    </w:p>
+    <w:p>
+      <w:pPr>
+        <w:pStyle w:val="BodyText"/>
+      </w:pPr>
+      <w:r>
+        <w:t xml:space="preserve">El capataz le anuncia una cosecha nueva —«Aquí cosecharás miles de cargas de estaño»— y le muestra su esputo sanguinolento: «esta es la bonificación» (ibid.: 142). El ascensorista Calixto baja luego la jaula donde siete hombres van «apeñuscados contra la rejilla», y Condori siente, «como si faltase suelo bajo sus pies», «la vertiginosa caída» (ibid.: 143). Martin lee el ascensor de</w:t>
       </w:r>
       <w:r>
         <w:t xml:space="preserve"> </w:t>
@@ -926,7 +979,7 @@
         <w:t xml:space="preserve"> </w:t>
       </w:r>
       <w:r>
-        <w:t xml:space="preserve">como un «teatro de la crueldad» (Martin, 2014: 69); la comparación es útil si obliga a preguntar quién opera la jaula y quién decide el descenso, preguntas que la novela responde con nombres y cargos: el ascensorista, el capataz, la empresa. Abajo, a Condori le dan «una carretilla para acarrear metal» (Botelho Gosálvez, 1982 [1945]: 144). La galería se apuntala con callapos, vigas de madera que sostienen los techos (ibid.: 145, 160); la empresa solo da «mezquinas lamparillas», y «no se conocían entonces cascos protectores ni las botas de goma» (ibid.: 145). La mina también enseña y une: Condori comparte «una solidaridad nacida del peligro y la miseria» y los relatos del Tío, el Gallo y la Viuda (ibid.: 148-149).</w:t>
+        <w:t xml:space="preserve">como un «teatro de la crueldad» (Martin, 2014: 69); la comparación es útil si obliga a preguntar quién opera la jaula y quién decide el descenso, preguntas que la novela responde con nombres y cargos: el ascensorista, el capataz, la empresa. Abajo, a Condori le dan «una carretilla para acarrear metal» (Botelho Gosálvez, 1982 [1945]: 144). La galería invierte la lógica de la chujlla: la masa se excava y un armazón de madera la contiene. Se apuntala con callapos, vigas que sostienen los techos (ibid.: 160); en el «450», que «se derrumbaba en algunos pasos», el revestimiento apenas se estaba colocando, la empresa solo daba «mezquinas lamparillas» y «no se conocían entonces cascos protectores ni las botas de goma» (ibid.: 145). La mina también enseña y une: Condori comparte «una solidaridad nacida del peligro y la miseria» y los relatos del Tío, el Gallo y la Viuda (ibid.: 148-149).</w:t>
       </w:r>
     </w:p>
     <w:p>
@@ -959,7 +1012,7 @@
         <w:pStyle w:val="BodyText"/>
       </w:pPr>
       <w:r>
-        <w:t xml:space="preserve">Para el dibujo, el pasaje ofrece una secuencia de niveles del agua y del barro —tobillos, rodilla, cintura, ombligo (ibid.: 145, 152-153)—, lámparas, una viga, un grupo que se divide y tres pasos de retroceso. No ofrece anchos, largos ni la posición de cada cuerpo, que la imagen deberá proponer como conjetura. El riesgo es evidente: una forma oscura y opresiva puede sugerir el peligro, pero no explica una oferta salarial ni un disparo. La prueba del dibujo será si logra mostrar quién cierra la salida.</w:t>
+        <w:t xml:space="preserve">Para el dibujo, el pasaje ofrece una secuencia de niveles del agua y del barro —tobillos, rodilla, cintura, ombligo (ibid.: 145, 152-153)—, lámparas que dejan de verse, una viga, un grupo que se divide y tres pasos de retroceso. No ofrece anchos, largos ni la posición de cada cuerpo: mide la galería con el cuerpo, por el contacto con el agua, el movimiento y el equilibrio. Garrington llama «háptico» a ese conjunto, un «término paraguas» para el tacto, la cinestesia, la propiocepción y el sentido vestibular (Garrington, 2013: 16); tomamos su definición, no su tesis sobre el modernismo anglófono. El pastel, que trabaja por contacto, no reproduce esa experiencia, pero puede adoptar las unidades que da el texto y proponer las demás como conjetura. El riesgo es evidente: una forma oscura y opresiva puede sugerir el peligro, pero no explica una oferta salarial ni un disparo. La prueba del dibujo será si logra mostrar quién cierra la salida.</w:t>
       </w:r>
     </w:p>
     <w:bookmarkEnd w:id="16"/>
@@ -1002,7 +1055,31 @@
         <w:pStyle w:val="FirstParagraph"/>
       </w:pPr>
       <w:r>
-        <w:t xml:space="preserve">El pasaje describe el olvido con términos de fortificación: muralla, foso, atalaya. Recordar lo próspero exige no mirar el hambre, y la novela confirma esa elección al final: con la cosecha, los derrotados «olvidaron la pesadilla pasada» (ibid.: 159). Es la segunda forma de memoria que el texto pone en juego: la de los sobrevivientes, que reparan el lugar seleccionando lo que recuerdan. También la pertenencia se selecciona. La lista de quienes regresan —«los Villca, los Huanca, los Huallpa, los Yupanqui, los Ticona, los Choque, los Chuquihuanca» (ibid.: 156)— repite en el mismo orden la «burguesía» y los «pequeño-burgueses» de la escala inicial, sin los Condori, Mamani y Quispe del «proletariado campesino» (ibid.: 22). Juan Condori quedó en el cementerio de los mineros; los restos de Basilio Quispe, enterrados en muchos sitios por la propia comunidad. La narración, que conserva ambas muertes, guarda lo que el ayllu reparado prefiere no mirar. El cierre del narrador, una Pachamama «repuesta» que recupera «su prestigio de hembra paridora y múltiple» (ibid.: 159), devuelve a la tierra lo que la trama había mostrado como obra de decisiones humanas, y feminiza el suelo como lo hacía desde el comienzo.</w:t>
+        <w:t xml:space="preserve">El pasaje describe el olvido con términos de fortificación: muralla, foso, atalaya. Recordar lo próspero exige no mirar el hambre, y la novela confirma esa elección al final: con la cosecha, los derrotados «olvidaron la pesadilla pasada» (ibid.: 159). Es la segunda forma de memoria que el texto pone en juego: la de los sobrevivientes, que reparan el lugar seleccionando lo que recuerdan. También la pertenencia se selecciona. La lista de quienes regresan —«los Villca, los Huanca, los Huallpa, los Yupanqui, los Ticona, los Choque, los Chuquihuanca» (ibid.: 156)— repite en el mismo orden la «burguesía» y los «pequeño-burgueses» de la escala inicial, sin los Condori, Mamani y Quispe del «proletariado campesino» (ibid.: 22). Juan Condori quedó en el cementerio de los mineros; los restos de Basilio Quispe, enterrados en muchos sitios por la propia comunidad. La narración, que conserva ambas muertes, guarda lo que el ayllu reparado prefiere no mirar.</w:t>
+      </w:r>
+    </w:p>
+    <w:p>
+      <w:pPr>
+        <w:pStyle w:val="BodyText"/>
+      </w:pPr>
+      <w:r>
+        <w:t xml:space="preserve">Ursula K. Le Guin contrapuso dos formas del relato: la flecha, que «comienza aquí y va recta hacia allí y ¡ZAS! da en su blanco (que cae muerto)», y la bolsa, la novela como un botiquín que «contiene cosas en una relación particular, poderosa, entre sí, y con nosotros» (Le Guin, 2021 [1986]: 10).</w:t>
+      </w:r>
+      <w:r>
+        <w:t xml:space="preserve"> </w:t>
+      </w:r>
+      <w:r>
+        <w:rPr>
+          <w:i/>
+          <w:iCs/>
+        </w:rPr>
+        <w:t xml:space="preserve">Altiplano</w:t>
+      </w:r>
+      <w:r>
+        <w:t xml:space="preserve"> </w:t>
+      </w:r>
+      <w:r>
+        <w:t xml:space="preserve">tiene ambas. El episodio de la mina es una flecha: incentivo, avance, amenaza, disparo. La novela, sin un héroe que la ordene, carga con tres trayectorias familiares y con las muertes que el retorno deja fuera, aunque no todo recipiente cuida en ella: el pesebre se vuelve tumba y la jaula baja a los hombres hacia el plano inundado. El cierre del narrador devuelve, en cambio, el relato a sus héroes: con la cosecha, los derrotados vuelven a ser «los patriarcas fecundadores del suelo, los sembradores del destino», y la Pachamama, «repuesta», recupera «su prestigio de hembra paridora y múltiple» (Botelho Gosálvez, 1982 [1945]: 159). Que la tierra sea femenina no es invención suya: según una creencia andina de origen prehispánico, la tierra, Pachamama, es femenina, mientras que piedras y montañas suelen ser masculinas (Dean, 2010: 68). Suyo es el registro zoológico con que la nombra, el mismo con que describió a Justina, y la devolución a la tierra de lo que la trama había mostrado como obra de decisiones humanas.</w:t>
       </w:r>
     </w:p>
     <w:bookmarkEnd w:id="18"/>
@@ -1036,7 +1113,7 @@
         <w:t xml:space="preserve"> </w:t>
       </w:r>
       <w:r>
-        <w:t xml:space="preserve">no sitúa la protección dentro del ayllu y la amenaza fuera: la tierra está desigualmente repartida, la comunidad expulsa primero a los sin tierra y lincha al yatiri, y la aldea, la finca y la mina alojan a los desplazados solo mientras pagan o trabajan. Segundo, el desamparo tiene agentes y objetos identificables —una ordenanza firmada, un libro exhibido por su tamaño, un cuarto atado al rendimiento, una papeleta médica, unas huellas dactilares, un revólver—: la novela no deja que el espacio cargue con decisiones que atribuye a personas. Tercero, la memoria entra por dos vías: la narración conserva un crimen que nadie en su mundo sospecha, y el retorno repara el lugar seleccionando lo que se recuerda y a quiénes se nombra. El narrador, en cambio, tiende a explicar como fuerza telúrica o rasgo de raza lo que la trama muestra como trabajo, orden y violencia; distinguir ambos planos es condición de la lectura.</w:t>
+        <w:t xml:space="preserve">no sitúa la protección dentro del ayllu y la amenaza fuera: la tierra está desigualmente repartida, la comunidad expulsa primero a los sin tierra y lincha al yatiri, y la aldea, la finca y la mina alojan a los desplazados solo mientras pagan o trabajan. Segundo, el desamparo tiene agentes y objetos identificables —una ordenanza firmada, un libro exhibido por su tamaño, un cuarto atado al rendimiento, una papeleta médica, unas huellas dactilares, un revólver—: la novela no deja que el espacio cargue con decisiones que atribuye a personas. Varios de esos objetos son instrumentos de legibilidad en el sentido de Scott, pero no los maneja un Estado central: los manejan poderes locales —el alcalde, los doctores, el tinterillo— y una compañía extranjera. Tercero, la memoria entra por dos vías: la narración conserva un crimen que nadie en su mundo sospecha, y el retorno repara el lugar seleccionando lo que se recuerda y a quiénes se nombra. El narrador, en cambio, tiende a explicar como fuerza telúrica o rasgo de raza lo que la trama muestra como trabajo, orden y violencia; distinguir ambos planos es condición de la lectura.</w:t>
       </w:r>
     </w:p>
     <w:p>
@@ -1321,6 +1398,69 @@
         <w:pStyle w:val="BodyText"/>
       </w:pPr>
       <w:r>
+        <w:t xml:space="preserve">Dean, Carolyn (2010).</w:t>
+      </w:r>
+      <w:r>
+        <w:t xml:space="preserve"> </w:t>
+      </w:r>
+      <w:r>
+        <w:rPr>
+          <w:i/>
+          <w:iCs/>
+        </w:rPr>
+        <w:t xml:space="preserve">A Culture of Stone: Inka Perspectives on Rock</w:t>
+      </w:r>
+      <w:r>
+        <w:t xml:space="preserve">. Durham y Londres: Duke University Press.</w:t>
+      </w:r>
+    </w:p>
+    <w:p>
+      <w:pPr>
+        <w:pStyle w:val="BodyText"/>
+      </w:pPr>
+      <w:r>
+        <w:t xml:space="preserve">Frampton, Kenneth (1995).</w:t>
+      </w:r>
+      <w:r>
+        <w:t xml:space="preserve"> </w:t>
+      </w:r>
+      <w:r>
+        <w:rPr>
+          <w:i/>
+          <w:iCs/>
+        </w:rPr>
+        <w:t xml:space="preserve">Studies in Tectonic Culture: The Poetics of Construction in Nineteenth and Twentieth Century Architecture</w:t>
+      </w:r>
+      <w:r>
+        <w:t xml:space="preserve">. Ed. John Cava. Cambridge (Massachusetts) y Londres: MIT Press.</w:t>
+      </w:r>
+    </w:p>
+    <w:p>
+      <w:pPr>
+        <w:pStyle w:val="BodyText"/>
+      </w:pPr>
+      <w:r>
+        <w:t xml:space="preserve">Garrington, Abbie (2013).</w:t>
+      </w:r>
+      <w:r>
+        <w:t xml:space="preserve"> </w:t>
+      </w:r>
+      <w:r>
+        <w:rPr>
+          <w:i/>
+          <w:iCs/>
+        </w:rPr>
+        <w:t xml:space="preserve">Haptic Modernism: Touch and the Tactile in Modernist Writing</w:t>
+      </w:r>
+      <w:r>
+        <w:t xml:space="preserve">. Edimburgo: Edinburgh University Press.</w:t>
+      </w:r>
+    </w:p>
+    <w:p>
+      <w:pPr>
+        <w:pStyle w:val="BodyText"/>
+      </w:pPr>
+      <w:r>
         <w:t xml:space="preserve">Lefebvre, Henri (1991 [1974]).</w:t>
       </w:r>
       <w:r>
@@ -1342,6 +1482,23 @@
         <w:pStyle w:val="BodyText"/>
       </w:pPr>
       <w:r>
+        <w:t xml:space="preserve">Le Guin, Ursula K. (2021 [1986]).</w:t>
+      </w:r>
+      <w:r>
+        <w:t xml:space="preserve"> </w:t>
+      </w:r>
+      <w:r>
+        <w:t xml:space="preserve">“La teoría de la bolsa de transporte de la ficción”</w:t>
+      </w:r>
+      <w:r>
+        <w:t xml:space="preserve">. Trad. Kamen Nedev y José Pérez de Lama. Biblioteca Anarquista. https://es.theanarchistlibrary.org</w:t>
+      </w:r>
+    </w:p>
+    <w:p>
+      <w:pPr>
+        <w:pStyle w:val="BodyText"/>
+      </w:pPr>
+      <w:r>
         <w:t xml:space="preserve">Lundberg, Simon (2019).</w:t>
       </w:r>
       <w:r>
@@ -1419,6 +1576,27 @@
       </w:r>
       <w:r>
         <w:t xml:space="preserve">. Londres: Faber and Faber.</w:t>
+      </w:r>
+    </w:p>
+    <w:p>
+      <w:pPr>
+        <w:pStyle w:val="BodyText"/>
+      </w:pPr>
+      <w:r>
+        <w:t xml:space="preserve">Scott, James C. (2020 [1998]).</w:t>
+      </w:r>
+      <w:r>
+        <w:t xml:space="preserve"> </w:t>
+      </w:r>
+      <w:r>
+        <w:rPr>
+          <w:i/>
+          <w:iCs/>
+        </w:rPr>
+        <w:t xml:space="preserve">Seeing Like a State: How Certain Schemes to Improve the Human Condition Have Failed</w:t>
+      </w:r>
+      <w:r>
+        <w:t xml:space="preserve">. New Haven y Londres: Yale University Press.</w:t>
       </w:r>
     </w:p>
     <w:p>

</xml_diff>